<commit_message>
Aggiunta Comandi Modifica Nome Branch
</commit_message>
<xml_diff>
--- a/comandiGit.docx
+++ b/comandiGit.docx
@@ -567,6 +567,341 @@
       </w:r>
       <w:r>
         <w:t xml:space="preserve"> (Questo succede perché devi aggiornare il git locale con il server remoto)</w:t>
+      </w:r>
+    </w:p>
+    <w:p>
+      <w:r>
+        <w:br w:type="page"/>
+      </w:r>
+    </w:p>
+    <w:p>
+      <w:pPr>
+        <w:pStyle w:val="Titolo1"/>
+      </w:pPr>
+      <w:r>
+        <w:lastRenderedPageBreak/>
+        <w:t>Rinominare un branch</w:t>
+      </w:r>
+    </w:p>
+    <w:p>
+      <w:r>
+        <w:drawing>
+          <wp:anchor distT="0" distB="0" distL="114300" distR="114300" simplePos="0" relativeHeight="251658240" behindDoc="0" locked="0" layoutInCell="1" allowOverlap="1" wp14:anchorId="53992569" wp14:editId="61DF612E">
+            <wp:simplePos x="0" y="0"/>
+            <wp:positionH relativeFrom="column">
+              <wp:posOffset>-4473</wp:posOffset>
+            </wp:positionH>
+            <wp:positionV relativeFrom="page">
+              <wp:posOffset>1884459</wp:posOffset>
+            </wp:positionV>
+            <wp:extent cx="4171950" cy="1114425"/>
+            <wp:effectExtent l="0" t="0" r="0" b="9525"/>
+            <wp:wrapTopAndBottom/>
+            <wp:docPr id="1921485721" name="Immagine 1"/>
+            <wp:cNvGraphicFramePr>
+              <a:graphicFrameLocks xmlns:a="http://schemas.openxmlformats.org/drawingml/2006/main" noChangeAspect="1"/>
+            </wp:cNvGraphicFramePr>
+            <a:graphic xmlns:a="http://schemas.openxmlformats.org/drawingml/2006/main">
+              <a:graphicData uri="http://schemas.openxmlformats.org/drawingml/2006/picture">
+                <pic:pic xmlns:pic="http://schemas.openxmlformats.org/drawingml/2006/picture">
+                  <pic:nvPicPr>
+                    <pic:cNvPr id="1921485721" name=""/>
+                    <pic:cNvPicPr/>
+                  </pic:nvPicPr>
+                  <pic:blipFill>
+                    <a:blip r:embed="rId4">
+                      <a:extLst>
+                        <a:ext uri="{28A0092B-C50C-407E-A947-70E740481C1C}">
+                          <a14:useLocalDpi xmlns:a14="http://schemas.microsoft.com/office/drawing/2010/main" val="0"/>
+                        </a:ext>
+                      </a:extLst>
+                    </a:blip>
+                    <a:stretch>
+                      <a:fillRect/>
+                    </a:stretch>
+                  </pic:blipFill>
+                  <pic:spPr>
+                    <a:xfrm>
+                      <a:off x="0" y="0"/>
+                      <a:ext cx="4171950" cy="1114425"/>
+                    </a:xfrm>
+                    <a:prstGeom prst="rect">
+                      <a:avLst/>
+                    </a:prstGeom>
+                  </pic:spPr>
+                </pic:pic>
+              </a:graphicData>
+            </a:graphic>
+          </wp:anchor>
+        </w:drawing>
+      </w:r>
+      <w:r>
+        <w:t xml:space="preserve">Supponiamo di aver creato in locale e in remoto un branch con il nome di </w:t>
+      </w:r>
+      <w:r>
+        <w:rPr>
+          <w:i/>
+          <w:iCs/>
+        </w:rPr>
+        <w:t xml:space="preserve">“master” </w:t>
+      </w:r>
+      <w:r>
+        <w:t xml:space="preserve"> ma vogliamo rinominarlo da questo momento in poi in </w:t>
+      </w:r>
+      <w:r>
+        <w:rPr>
+          <w:i/>
+          <w:iCs/>
+        </w:rPr>
+        <w:t xml:space="preserve">“main” </w:t>
+      </w:r>
+      <w:r>
+        <w:t>. Cominciamo con lo spostarci sul branch che vogliamo rinominare ad esempio:</w:t>
+      </w:r>
+    </w:p>
+    <w:p>
+      <w:pPr>
+        <w:spacing w:before="160" w:line="320" w:lineRule="exact"/>
+      </w:pPr>
+      <w:r>
+        <w:t xml:space="preserve">In questo caso dobbiamo ora lanciare il comando: </w:t>
+      </w:r>
+      <w:r>
+        <w:rPr>
+          <w:highlight w:val="green"/>
+        </w:rPr>
+        <w:t>git branch -m &lt;nuovo-nome&gt;</w:t>
+      </w:r>
+      <w:r>
+        <w:t xml:space="preserve"> per rinominarlo da prima in locale ed ottenere:</w:t>
+      </w:r>
+    </w:p>
+    <w:p>
+      <w:pPr>
+        <w:spacing w:line="280" w:lineRule="exact"/>
+      </w:pPr>
+      <w:r>
+        <w:drawing>
+          <wp:anchor distT="0" distB="0" distL="114300" distR="114300" simplePos="0" relativeHeight="251660288" behindDoc="0" locked="0" layoutInCell="1" allowOverlap="1" wp14:anchorId="6F162C28" wp14:editId="0E0A4ABF">
+            <wp:simplePos x="0" y="0"/>
+            <wp:positionH relativeFrom="column">
+              <wp:posOffset>-5080</wp:posOffset>
+            </wp:positionH>
+            <wp:positionV relativeFrom="page">
+              <wp:posOffset>5796280</wp:posOffset>
+            </wp:positionV>
+            <wp:extent cx="4333240" cy="1296035"/>
+            <wp:effectExtent l="0" t="0" r="0" b="0"/>
+            <wp:wrapTopAndBottom/>
+            <wp:docPr id="592751257" name="Immagine 1"/>
+            <wp:cNvGraphicFramePr>
+              <a:graphicFrameLocks xmlns:a="http://schemas.openxmlformats.org/drawingml/2006/main" noChangeAspect="1"/>
+            </wp:cNvGraphicFramePr>
+            <a:graphic xmlns:a="http://schemas.openxmlformats.org/drawingml/2006/main">
+              <a:graphicData uri="http://schemas.openxmlformats.org/drawingml/2006/picture">
+                <pic:pic xmlns:pic="http://schemas.openxmlformats.org/drawingml/2006/picture">
+                  <pic:nvPicPr>
+                    <pic:cNvPr id="592751257" name=""/>
+                    <pic:cNvPicPr/>
+                  </pic:nvPicPr>
+                  <pic:blipFill>
+                    <a:blip r:embed="rId5">
+                      <a:extLst>
+                        <a:ext uri="{28A0092B-C50C-407E-A947-70E740481C1C}">
+                          <a14:useLocalDpi xmlns:a14="http://schemas.microsoft.com/office/drawing/2010/main" val="0"/>
+                        </a:ext>
+                      </a:extLst>
+                    </a:blip>
+                    <a:stretch>
+                      <a:fillRect/>
+                    </a:stretch>
+                  </pic:blipFill>
+                  <pic:spPr>
+                    <a:xfrm>
+                      <a:off x="0" y="0"/>
+                      <a:ext cx="4333240" cy="1296035"/>
+                    </a:xfrm>
+                    <a:prstGeom prst="rect">
+                      <a:avLst/>
+                    </a:prstGeom>
+                  </pic:spPr>
+                </pic:pic>
+              </a:graphicData>
+            </a:graphic>
+            <wp14:sizeRelH relativeFrom="margin">
+              <wp14:pctWidth>0</wp14:pctWidth>
+            </wp14:sizeRelH>
+            <wp14:sizeRelV relativeFrom="margin">
+              <wp14:pctHeight>0</wp14:pctHeight>
+            </wp14:sizeRelV>
+          </wp:anchor>
+        </w:drawing>
+      </w:r>
+      <w:r>
+        <w:drawing>
+          <wp:anchor distT="0" distB="0" distL="114300" distR="114300" simplePos="0" relativeHeight="251661312" behindDoc="0" locked="0" layoutInCell="1" allowOverlap="1" wp14:anchorId="47AD550E" wp14:editId="43490D37">
+            <wp:simplePos x="0" y="0"/>
+            <wp:positionH relativeFrom="column">
+              <wp:posOffset>-52705</wp:posOffset>
+            </wp:positionH>
+            <wp:positionV relativeFrom="page">
+              <wp:posOffset>7354570</wp:posOffset>
+            </wp:positionV>
+            <wp:extent cx="3776345" cy="1940560"/>
+            <wp:effectExtent l="0" t="0" r="0" b="2540"/>
+            <wp:wrapTopAndBottom/>
+            <wp:docPr id="1307049497" name="Immagine 1"/>
+            <wp:cNvGraphicFramePr>
+              <a:graphicFrameLocks xmlns:a="http://schemas.openxmlformats.org/drawingml/2006/main" noChangeAspect="1"/>
+            </wp:cNvGraphicFramePr>
+            <a:graphic xmlns:a="http://schemas.openxmlformats.org/drawingml/2006/main">
+              <a:graphicData uri="http://schemas.openxmlformats.org/drawingml/2006/picture">
+                <pic:pic xmlns:pic="http://schemas.openxmlformats.org/drawingml/2006/picture">
+                  <pic:nvPicPr>
+                    <pic:cNvPr id="1307049497" name=""/>
+                    <pic:cNvPicPr/>
+                  </pic:nvPicPr>
+                  <pic:blipFill>
+                    <a:blip r:embed="rId6">
+                      <a:extLst>
+                        <a:ext uri="{28A0092B-C50C-407E-A947-70E740481C1C}">
+                          <a14:useLocalDpi xmlns:a14="http://schemas.microsoft.com/office/drawing/2010/main" val="0"/>
+                        </a:ext>
+                      </a:extLst>
+                    </a:blip>
+                    <a:stretch>
+                      <a:fillRect/>
+                    </a:stretch>
+                  </pic:blipFill>
+                  <pic:spPr>
+                    <a:xfrm>
+                      <a:off x="0" y="0"/>
+                      <a:ext cx="3776345" cy="1940560"/>
+                    </a:xfrm>
+                    <a:prstGeom prst="rect">
+                      <a:avLst/>
+                    </a:prstGeom>
+                  </pic:spPr>
+                </pic:pic>
+              </a:graphicData>
+            </a:graphic>
+            <wp14:sizeRelH relativeFrom="margin">
+              <wp14:pctWidth>0</wp14:pctWidth>
+            </wp14:sizeRelH>
+            <wp14:sizeRelV relativeFrom="margin">
+              <wp14:pctHeight>0</wp14:pctHeight>
+            </wp14:sizeRelV>
+          </wp:anchor>
+        </w:drawing>
+      </w:r>
+      <w:r>
+        <w:drawing>
+          <wp:anchor distT="0" distB="0" distL="114300" distR="114300" simplePos="0" relativeHeight="251659264" behindDoc="0" locked="0" layoutInCell="1" allowOverlap="1" wp14:anchorId="6CC3EF2E" wp14:editId="69579466">
+            <wp:simplePos x="0" y="0"/>
+            <wp:positionH relativeFrom="column">
+              <wp:posOffset>3479</wp:posOffset>
+            </wp:positionH>
+            <wp:positionV relativeFrom="page">
+              <wp:posOffset>3474720</wp:posOffset>
+            </wp:positionV>
+            <wp:extent cx="4010025" cy="1514475"/>
+            <wp:effectExtent l="0" t="0" r="9525" b="9525"/>
+            <wp:wrapTopAndBottom/>
+            <wp:docPr id="473313071" name="Immagine 1"/>
+            <wp:cNvGraphicFramePr>
+              <a:graphicFrameLocks xmlns:a="http://schemas.openxmlformats.org/drawingml/2006/main" noChangeAspect="1"/>
+            </wp:cNvGraphicFramePr>
+            <a:graphic xmlns:a="http://schemas.openxmlformats.org/drawingml/2006/main">
+              <a:graphicData uri="http://schemas.openxmlformats.org/drawingml/2006/picture">
+                <pic:pic xmlns:pic="http://schemas.openxmlformats.org/drawingml/2006/picture">
+                  <pic:nvPicPr>
+                    <pic:cNvPr id="473313071" name=""/>
+                    <pic:cNvPicPr/>
+                  </pic:nvPicPr>
+                  <pic:blipFill>
+                    <a:blip r:embed="rId7">
+                      <a:extLst>
+                        <a:ext uri="{28A0092B-C50C-407E-A947-70E740481C1C}">
+                          <a14:useLocalDpi xmlns:a14="http://schemas.microsoft.com/office/drawing/2010/main" val="0"/>
+                        </a:ext>
+                      </a:extLst>
+                    </a:blip>
+                    <a:stretch>
+                      <a:fillRect/>
+                    </a:stretch>
+                  </pic:blipFill>
+                  <pic:spPr>
+                    <a:xfrm>
+                      <a:off x="0" y="0"/>
+                      <a:ext cx="4010025" cy="1514475"/>
+                    </a:xfrm>
+                    <a:prstGeom prst="rect">
+                      <a:avLst/>
+                    </a:prstGeom>
+                  </pic:spPr>
+                </pic:pic>
+              </a:graphicData>
+            </a:graphic>
+          </wp:anchor>
+        </w:drawing>
+      </w:r>
+      <w:r>
+        <w:t xml:space="preserve">Come si nota dallo screen in locale abbiamo già il branch main mentre in remoto siamo rimasti con il master, il vecchio nome. Per sistemare e allineare i due basta creare un nuovo branch sul remoto con il nuovo nome ed eliminare il vecchio branch tramite i comandi: </w:t>
+      </w:r>
+      <w:r>
+        <w:rPr>
+          <w:highlight w:val="green"/>
+        </w:rPr>
+        <w:t>git push origin -u &lt;nuovo-nome&gt;</w:t>
+      </w:r>
+      <w:r>
+        <w:t xml:space="preserve"> e per cancellare il vecchio branch: </w:t>
+      </w:r>
+      <w:r>
+        <w:rPr>
+          <w:highlight w:val="green"/>
+        </w:rPr>
+        <w:t xml:space="preserve">git push origin </w:t>
+      </w:r>
+      <w:r>
+        <w:rPr>
+          <w:highlight w:val="green"/>
+        </w:rPr>
+        <w:t>–</w:t>
+      </w:r>
+      <w:r>
+        <w:rPr>
+          <w:highlight w:val="green"/>
+        </w:rPr>
+        <w:t>d</w:t>
+      </w:r>
+    </w:p>
+    <w:p>
+      <w:pPr>
+        <w:spacing w:line="280" w:lineRule="exact"/>
+        <w:rPr>
+          <w:color w:val="EE0000"/>
+        </w:rPr>
+      </w:pPr>
+      <w:r>
+        <w:rPr>
+          <w:color w:val="EE0000"/>
+        </w:rPr>
+        <w:t>ATTENZIONE</w:t>
+      </w:r>
+    </w:p>
+    <w:p>
+      <w:pPr>
+        <w:spacing w:line="280" w:lineRule="exact"/>
+        <w:rPr>
+          <w:color w:val="EE0000"/>
+        </w:rPr>
+      </w:pPr>
+      <w:r>
+        <w:rPr>
+          <w:color w:val="EE0000"/>
+        </w:rPr>
+        <w:t>Se si cerca di eliminare un brach impostato da GH come default da errore, cambiarlo prima da settings di GH e poi eliminarlo dal remoto</w:t>
       </w:r>
     </w:p>
     <w:sectPr>
@@ -1185,7 +1520,6 @@
   <w:style w:type="character" w:default="1" w:styleId="Carpredefinitoparagrafo">
     <w:name w:val="Default Paragraph Font"/>
     <w:uiPriority w:val="1"/>
-    <w:semiHidden/>
     <w:unhideWhenUsed/>
   </w:style>
   <w:style w:type="table" w:default="1" w:styleId="Tabellanormale">

</xml_diff>